<commit_message>
docs(entrega1): seccion 1.5, heatmap EVD-2-05, CTRL-22 y sincronizacion con GitHub
</commit_message>
<xml_diff>
--- a/docs/entregas/Entrega1_Seccion_1-5_Scope_Tecnico.docx
+++ b/docs/entregas/Entrega1_Seccion_1-5_Scope_Tecnico.docx
@@ -12110,21 +12110,6 @@
           <w:sz w:val="24"/>
           <w:szCs w:val="24"/>
         </w:rPr>
-        <w:t xml:space="preserve">OWASP Foundation. (2023). OWASP API Security Top 10 2023. https://owasp.org/API-Security/editions/2023/en/0x00-header/</w:t>
-      </w:r>
-    </w:p>
-    <w:p>
-      <w:pPr>
-        <w:spacing w:after="100" w:line="360" w:lineRule="auto"/>
-        <w:ind w:left="720" w:hanging="720"/>
-        <w:jc w:val="both"/>
-      </w:pPr>
-      <w:r>
-        <w:rPr>
-          <w:rFonts w:ascii="Arial" w:cs="Arial" w:eastAsia="Arial" w:hAnsi="Arial"/>
-          <w:sz w:val="24"/>
-          <w:szCs w:val="24"/>
-        </w:rPr>
         <w:t xml:space="preserve">OWASP Foundation. (s. f.-a). OWASP Mobile Application Security Verification Standard (MASVS). https://mas.owasp.org/MASVS/</w:t>
       </w:r>
     </w:p>
@@ -12155,6 +12140,21 @@
           <w:sz w:val="24"/>
           <w:szCs w:val="24"/>
         </w:rPr>
+        <w:t xml:space="preserve">OWASP Foundation. (2023). OWASP API Security Top 10 2023. https://owasp.org/API-Security/editions/2023/en/0x00-header/</w:t>
+      </w:r>
+    </w:p>
+    <w:p>
+      <w:pPr>
+        <w:spacing w:after="100" w:line="360" w:lineRule="auto"/>
+        <w:ind w:left="720" w:hanging="720"/>
+        <w:jc w:val="both"/>
+      </w:pPr>
+      <w:r>
+        <w:rPr>
+          <w:rFonts w:ascii="Arial" w:cs="Arial" w:eastAsia="Arial" w:hAnsi="Arial"/>
+          <w:sz w:val="24"/>
+          <w:szCs w:val="24"/>
+        </w:rPr>
         <w:t xml:space="preserve">OWASP Foundation. (2024). OWASP Threat Dragon. https://owasp.org/www-project-threat-dragon/</w:t>
       </w:r>
     </w:p>
@@ -12170,7 +12170,7 @@
           <w:sz w:val="24"/>
           <w:szCs w:val="24"/>
         </w:rPr>
-        <w:t xml:space="preserve">Scarfone, K., Souppaya, M., Cody, A., &amp; Orebaugh, A. (2008). Technical guide to information security testing and assessment (NIST SP 800-115). National Institute of Standards and Technology. https://doi.org/10.6028/NIST.SP.800-115</w:t>
+        <w:t xml:space="preserve">OWASP Foundation. (2025). OWASP Top 10:2025. https://owasp.org/Top10/2025/</w:t>
       </w:r>
     </w:p>
     <w:p>
@@ -12185,7 +12185,7 @@
           <w:sz w:val="24"/>
           <w:szCs w:val="24"/>
         </w:rPr>
-        <w:t xml:space="preserve">[VERIFICAR] OWASP Foundation. (2025). OWASP Top 10:2025. Confirmar URL y fecha de publicación de la edición vigente antes de la entrega.</w:t>
+        <w:t xml:space="preserve">Scarfone, K., Souppaya, M., Cody, A., &amp; Orebaugh, A. (2008). Technical guide to information security testing and assessment (NIST SP 800-115). National Institute of Standards and Technology. https://doi.org/10.6028/NIST.SP.800-115</w:t>
       </w:r>
     </w:p>
     <w:sectPr>

</xml_diff>

<commit_message>
docs(entrega1): correcciones de la seccion 2 (impacto vs criticidad, dueno del riesgo, CTRL-23)
</commit_message>
<xml_diff>
--- a/docs/entregas/Entrega1_Seccion_1-5_Scope_Tecnico.docx
+++ b/docs/entregas/Entrega1_Seccion_1-5_Scope_Tecnico.docx
@@ -183,7 +183,7 @@
           <w:sz w:val="20"/>
           <w:szCs w:val="20"/>
         </w:rPr>
-        <w:t xml:space="preserve">Elaboración propia. Las líneas verdes representan flujos con un control de seguridad asociado y las etiquetas CTRL-xx indican el control que actúa en cada componente o frontera. El detalle de cada control está en la Tabla 9.</w:t>
+        <w:t xml:space="preserve">Elaboración propia. Las líneas verdes representan flujos con un control de seguridad asociado y las etiquetas CTRL-xx indican el control que actúa en cada componente o frontera. El detalle de cada control está en la Tabla 9. CTRL-23 (verificación de identidad en soporte y capacitación contra ingeniería social) es un control de procedimiento y no se dibuja.</w:t>
       </w:r>
     </w:p>
     <w:p>
@@ -4177,7 +4177,7 @@
           <w:sz w:val="24"/>
           <w:szCs w:val="24"/>
         </w:rPr>
-        <w:t xml:space="preserve">Para mantener legible el diagrama, el detalle de los veintidós controles se recoge en la Tabla 9, que ubica cada control en el componente o frontera donde actúa, lo asocia a la capa de las siete capas de defensa y resume qué asegura. Esta tabla es la referencia del mapeo que la Figura 1 representa de forma gráfica.</w:t>
+        <w:t xml:space="preserve">Para mantener legible el diagrama, el detalle de los veintitrés controles se recoge en la Tabla 9, que ubica cada control en el componente o frontera donde actúa, lo asocia a la capa de las siete capas de defensa y resume qué asegura. Esta tabla es la referencia del mapeo que la Figura 1 representa de forma gráfica.</w:t>
       </w:r>
     </w:p>
     <w:p>
@@ -5836,6 +5836,140 @@
                 <w:szCs w:val="16"/>
               </w:rPr>
               <w:t xml:space="preserve">Autorización por función (grupo admins) y registro de auditoría</w:t>
+            </w:r>
+          </w:p>
+        </w:tc>
+      </w:tr>
+      <w:tr>
+        <w:tc>
+          <w:tcPr>
+            <w:tcW w:type="dxa" w:w="2550"/>
+            <w:tcBorders>
+              <w:top w:val="none" w:color="FFFFFF" w:sz="0"/>
+              <w:left w:val="none" w:color="FFFFFF" w:sz="0"/>
+              <w:bottom w:val="none" w:color="FFFFFF" w:sz="0"/>
+              <w:right w:val="none" w:color="FFFFFF" w:sz="0"/>
+            </w:tcBorders>
+            <w:tcMar>
+              <w:top w:type="dxa" w:w="40"/>
+              <w:left w:type="dxa" w:w="90"/>
+              <w:bottom w:type="dxa" w:w="40"/>
+              <w:right w:type="dxa" w:w="90"/>
+            </w:tcMar>
+          </w:tcPr>
+          <w:p>
+            <w:pPr>
+              <w:spacing w:after="0" w:line="240" w:lineRule="auto"/>
+              <w:jc w:val="left"/>
+            </w:pPr>
+            <w:r>
+              <w:rPr>
+                <w:rFonts w:ascii="Arial" w:cs="Arial" w:eastAsia="Arial" w:hAnsi="Arial"/>
+                <w:b w:val="false"/>
+                <w:bCs w:val="false"/>
+                <w:sz w:val="16"/>
+                <w:szCs w:val="16"/>
+              </w:rPr>
+              <w:t xml:space="preserve">Personal de soporte (TB2)</w:t>
+            </w:r>
+          </w:p>
+        </w:tc>
+        <w:tc>
+          <w:tcPr>
+            <w:tcW w:type="dxa" w:w="1750"/>
+            <w:tcBorders>
+              <w:top w:val="none" w:color="FFFFFF" w:sz="0"/>
+              <w:left w:val="none" w:color="FFFFFF" w:sz="0"/>
+              <w:bottom w:val="none" w:color="FFFFFF" w:sz="0"/>
+              <w:right w:val="none" w:color="FFFFFF" w:sz="0"/>
+            </w:tcBorders>
+            <w:tcMar>
+              <w:top w:type="dxa" w:w="40"/>
+              <w:left w:type="dxa" w:w="90"/>
+              <w:bottom w:type="dxa" w:w="40"/>
+              <w:right w:type="dxa" w:w="90"/>
+            </w:tcMar>
+          </w:tcPr>
+          <w:p>
+            <w:pPr>
+              <w:spacing w:after="0" w:line="240" w:lineRule="auto"/>
+              <w:jc w:val="left"/>
+            </w:pPr>
+            <w:r>
+              <w:rPr>
+                <w:rFonts w:ascii="Arial" w:cs="Arial" w:eastAsia="Arial" w:hAnsi="Arial"/>
+                <w:b w:val="false"/>
+                <w:bCs w:val="false"/>
+                <w:sz w:val="16"/>
+                <w:szCs w:val="16"/>
+              </w:rPr>
+              <w:t xml:space="preserve">CTRL-23</w:t>
+            </w:r>
+          </w:p>
+        </w:tc>
+        <w:tc>
+          <w:tcPr>
+            <w:tcW w:type="dxa" w:w="900"/>
+            <w:tcBorders>
+              <w:top w:val="none" w:color="FFFFFF" w:sz="0"/>
+              <w:left w:val="none" w:color="FFFFFF" w:sz="0"/>
+              <w:bottom w:val="none" w:color="FFFFFF" w:sz="0"/>
+              <w:right w:val="none" w:color="FFFFFF" w:sz="0"/>
+            </w:tcBorders>
+            <w:tcMar>
+              <w:top w:type="dxa" w:w="40"/>
+              <w:left w:type="dxa" w:w="90"/>
+              <w:bottom w:type="dxa" w:w="40"/>
+              <w:right w:type="dxa" w:w="90"/>
+            </w:tcMar>
+          </w:tcPr>
+          <w:p>
+            <w:pPr>
+              <w:spacing w:after="0" w:line="240" w:lineRule="auto"/>
+              <w:jc w:val="left"/>
+            </w:pPr>
+            <w:r>
+              <w:rPr>
+                <w:rFonts w:ascii="Arial" w:cs="Arial" w:eastAsia="Arial" w:hAnsi="Arial"/>
+                <w:b w:val="false"/>
+                <w:bCs w:val="false"/>
+                <w:sz w:val="16"/>
+                <w:szCs w:val="16"/>
+              </w:rPr>
+              <w:t xml:space="preserve">7</w:t>
+            </w:r>
+          </w:p>
+        </w:tc>
+        <w:tc>
+          <w:tcPr>
+            <w:tcW w:type="dxa" w:w="4160"/>
+            <w:tcBorders>
+              <w:top w:val="none" w:color="FFFFFF" w:sz="0"/>
+              <w:left w:val="none" w:color="FFFFFF" w:sz="0"/>
+              <w:bottom w:val="none" w:color="FFFFFF" w:sz="0"/>
+              <w:right w:val="none" w:color="FFFFFF" w:sz="0"/>
+            </w:tcBorders>
+            <w:tcMar>
+              <w:top w:type="dxa" w:w="40"/>
+              <w:left w:type="dxa" w:w="90"/>
+              <w:bottom w:type="dxa" w:w="40"/>
+              <w:right w:type="dxa" w:w="90"/>
+            </w:tcMar>
+          </w:tcPr>
+          <w:p>
+            <w:pPr>
+              <w:spacing w:after="0" w:line="240" w:lineRule="auto"/>
+              <w:jc w:val="left"/>
+            </w:pPr>
+            <w:r>
+              <w:rPr>
+                <w:rFonts w:ascii="Arial" w:cs="Arial" w:eastAsia="Arial" w:hAnsi="Arial"/>
+                <w:b w:val="false"/>
+                <w:bCs w:val="false"/>
+                <w:sz w:val="16"/>
+                <w:szCs w:val="16"/>
+              </w:rPr>
+              <w:t xml:space="preserve">Verificación de identidad del cliente por un canal distinto antes de bloquear, desbloquear o cambiar datos; capacitación anual contra ingeniería social</w:t>
             </w:r>
           </w:p>
         </w:tc>

</xml_diff>